<commit_message>
me uni con mi compañero Javier Bernal para hacer el desafio dos
</commit_message>
<xml_diff>
--- a/proyecto sorteo mundial.docx
+++ b/proyecto sorteo mundial.docx
@@ -20,6 +20,264 @@
           <w:noProof/>
           <w:lang w:val="es-CO"/>
         </w:rPr>
+        <w:t>DESAFIO DOS  INFORMATICA II</w:t>
+      </w:r>
+    </w:p>
+    <w:p>
+      <w:pPr>
+        <w:rPr>
+          <w:rFonts w:ascii="Arial" w:hAnsi="Arial" w:cs="Arial"/>
+          <w:b/>
+          <w:bCs/>
+          <w:noProof/>
+          <w:lang w:val="es-CO"/>
+        </w:rPr>
+      </w:pPr>
+    </w:p>
+    <w:p>
+      <w:pPr>
+        <w:rPr>
+          <w:rFonts w:ascii="Arial" w:hAnsi="Arial" w:cs="Arial"/>
+          <w:b/>
+          <w:bCs/>
+          <w:noProof/>
+          <w:lang w:val="es-CO"/>
+        </w:rPr>
+      </w:pPr>
+      <w:r>
+        <w:rPr>
+          <w:rFonts w:ascii="Arial" w:hAnsi="Arial" w:cs="Arial"/>
+          <w:b/>
+          <w:bCs/>
+          <w:noProof/>
+          <w:lang w:val="es-CO"/>
+        </w:rPr>
+        <w:t xml:space="preserve"> Fiesta mundial con UdeAWorldCup</w:t>
+      </w:r>
+    </w:p>
+    <w:p>
+      <w:pPr>
+        <w:rPr>
+          <w:rFonts w:ascii="Arial" w:hAnsi="Arial" w:cs="Arial"/>
+          <w:b/>
+          <w:bCs/>
+          <w:noProof/>
+          <w:lang w:val="es-CO"/>
+        </w:rPr>
+      </w:pPr>
+    </w:p>
+    <w:p>
+      <w:pPr>
+        <w:rPr>
+          <w:rFonts w:ascii="Arial" w:hAnsi="Arial" w:cs="Arial"/>
+          <w:b/>
+          <w:bCs/>
+          <w:noProof/>
+          <w:lang w:val="es-CO"/>
+        </w:rPr>
+      </w:pPr>
+      <w:r>
+        <w:rPr>
+          <w:rFonts w:ascii="Arial" w:hAnsi="Arial" w:cs="Arial"/>
+          <w:b/>
+          <w:bCs/>
+          <w:noProof/>
+          <w:lang w:val="es-CO"/>
+        </w:rPr>
+        <w:t xml:space="preserve">POR: </w:t>
+      </w:r>
+      <w:r>
+        <w:rPr>
+          <w:rFonts w:ascii="Arial" w:hAnsi="Arial" w:cs="Arial"/>
+          <w:b/>
+          <w:bCs/>
+          <w:noProof/>
+          <w:lang w:val="es-CO"/>
+        </w:rPr>
+        <w:br/>
+        <w:t>Javier Bernal</w:t>
+      </w:r>
+      <w:r>
+        <w:rPr>
+          <w:rFonts w:ascii="Arial" w:hAnsi="Arial" w:cs="Arial"/>
+          <w:b/>
+          <w:bCs/>
+          <w:noProof/>
+          <w:lang w:val="es-CO"/>
+        </w:rPr>
+        <w:br/>
+        <w:t xml:space="preserve">Bernardo Patiño </w:t>
+      </w:r>
+      <w:r>
+        <w:rPr>
+          <w:rFonts w:ascii="Arial" w:hAnsi="Arial" w:cs="Arial"/>
+          <w:b/>
+          <w:bCs/>
+          <w:noProof/>
+          <w:lang w:val="es-CO"/>
+        </w:rPr>
+        <w:br/>
+      </w:r>
+    </w:p>
+    <w:p>
+      <w:pPr>
+        <w:rPr>
+          <w:rFonts w:ascii="Arial" w:hAnsi="Arial" w:cs="Arial"/>
+          <w:b/>
+          <w:bCs/>
+          <w:noProof/>
+          <w:lang w:val="es-CO"/>
+        </w:rPr>
+      </w:pPr>
+    </w:p>
+    <w:p>
+      <w:pPr>
+        <w:rPr>
+          <w:rFonts w:ascii="Arial" w:hAnsi="Arial" w:cs="Arial"/>
+          <w:b/>
+          <w:bCs/>
+          <w:noProof/>
+          <w:lang w:val="es-CO"/>
+        </w:rPr>
+      </w:pPr>
+      <w:r>
+        <w:rPr>
+          <w:rFonts w:ascii="Arial" w:hAnsi="Arial" w:cs="Arial"/>
+          <w:b/>
+          <w:bCs/>
+          <w:noProof/>
+          <w:lang w:val="es-CO"/>
+        </w:rPr>
+        <w:t>Docente:</w:t>
+      </w:r>
+    </w:p>
+    <w:p>
+      <w:pPr>
+        <w:rPr>
+          <w:rFonts w:ascii="Arial" w:hAnsi="Arial" w:cs="Arial"/>
+          <w:b/>
+          <w:bCs/>
+          <w:noProof/>
+          <w:lang w:val="es-CO"/>
+        </w:rPr>
+      </w:pPr>
+      <w:r>
+        <w:rPr>
+          <w:rFonts w:ascii="Arial" w:hAnsi="Arial" w:cs="Arial"/>
+          <w:b/>
+          <w:bCs/>
+          <w:noProof/>
+          <w:lang w:val="es-CO"/>
+        </w:rPr>
+        <w:t xml:space="preserve">Augusto Londoño </w:t>
+      </w:r>
+    </w:p>
+    <w:p>
+      <w:pPr>
+        <w:rPr>
+          <w:rFonts w:ascii="Arial" w:hAnsi="Arial" w:cs="Arial"/>
+          <w:b/>
+          <w:bCs/>
+          <w:noProof/>
+          <w:lang w:val="es-CO"/>
+        </w:rPr>
+      </w:pPr>
+    </w:p>
+    <w:p>
+      <w:pPr>
+        <w:rPr>
+          <w:rFonts w:ascii="Arial" w:hAnsi="Arial" w:cs="Arial"/>
+          <w:b/>
+          <w:bCs/>
+          <w:noProof/>
+          <w:lang w:val="es-CO"/>
+        </w:rPr>
+      </w:pPr>
+    </w:p>
+    <w:p>
+      <w:pPr>
+        <w:rPr>
+          <w:rFonts w:ascii="Arial" w:hAnsi="Arial" w:cs="Arial"/>
+          <w:b/>
+          <w:bCs/>
+          <w:noProof/>
+          <w:lang w:val="es-CO"/>
+        </w:rPr>
+      </w:pPr>
+    </w:p>
+    <w:p>
+      <w:pPr>
+        <w:rPr>
+          <w:rFonts w:ascii="Arial" w:hAnsi="Arial" w:cs="Arial"/>
+          <w:b/>
+          <w:bCs/>
+          <w:noProof/>
+          <w:lang w:val="es-CO"/>
+        </w:rPr>
+      </w:pPr>
+    </w:p>
+    <w:p>
+      <w:pPr>
+        <w:rPr>
+          <w:rFonts w:ascii="Arial" w:hAnsi="Arial" w:cs="Arial"/>
+          <w:b/>
+          <w:bCs/>
+          <w:noProof/>
+          <w:lang w:val="es-CO"/>
+        </w:rPr>
+      </w:pPr>
+    </w:p>
+    <w:p>
+      <w:pPr>
+        <w:rPr>
+          <w:rFonts w:ascii="Arial" w:hAnsi="Arial" w:cs="Arial"/>
+          <w:b/>
+          <w:bCs/>
+          <w:noProof/>
+          <w:lang w:val="es-CO"/>
+        </w:rPr>
+      </w:pPr>
+    </w:p>
+    <w:p>
+      <w:pPr>
+        <w:rPr>
+          <w:rFonts w:ascii="Arial" w:hAnsi="Arial" w:cs="Arial"/>
+          <w:b/>
+          <w:bCs/>
+          <w:noProof/>
+          <w:lang w:val="es-CO"/>
+        </w:rPr>
+      </w:pPr>
+    </w:p>
+    <w:p>
+      <w:pPr>
+        <w:rPr>
+          <w:rFonts w:ascii="Arial" w:hAnsi="Arial" w:cs="Arial"/>
+          <w:b/>
+          <w:bCs/>
+          <w:noProof/>
+          <w:lang w:val="es-CO"/>
+        </w:rPr>
+      </w:pPr>
+    </w:p>
+    <w:p>
+      <w:pPr>
+        <w:rPr>
+          <w:rFonts w:ascii="Arial" w:hAnsi="Arial" w:cs="Arial"/>
+          <w:b/>
+          <w:bCs/>
+          <w:noProof/>
+          <w:lang w:val="es-CO"/>
+        </w:rPr>
+      </w:pPr>
+      <w:r>
+        <w:rPr>
+          <w:rFonts w:ascii="Arial" w:hAnsi="Arial" w:cs="Arial"/>
+          <w:b/>
+          <w:bCs/>
+          <w:noProof/>
+          <w:lang w:val="es-CO"/>
+        </w:rPr>
         <w:t>An</w:t>
       </w:r>
       <w:r>
@@ -116,6 +374,7 @@
           <w:noProof/>
           <w:lang w:val="es-CO"/>
         </w:rPr>
+        <w:lastRenderedPageBreak/>
         <w:t>Decisi</w:t>
       </w:r>
       <w:r>
@@ -467,6 +726,9 @@
         </w:drawing>
       </w:r>
       <w:r>
+        <w:rPr>
+          <w:noProof/>
+        </w:rPr>
         <w:drawing>
           <wp:anchor distT="0" distB="0" distL="114300" distR="114300" simplePos="0" relativeHeight="251658240" behindDoc="1" locked="0" layoutInCell="1" allowOverlap="1" wp14:anchorId="3E1F99E3" wp14:editId="4DA16303">
             <wp:simplePos x="0" y="0"/>

</xml_diff>